<commit_message>
Fix builtin dossier template rendering
</commit_message>
<xml_diff>
--- a/backend/static/builtin_templates/compact_esn.docx
+++ b/backend/static/builtin_templates/compact_esn.docx
@@ -234,17 +234,8 @@
             <w:shd w:val="clear" w:color="auto" w:fill="F2F2F2"/>
           </w:tcPr>
           <w:p>
-            <w:pPr>
-              <w:spacing w:after="0"/>
-            </w:pPr>
             <w:r>
-              <w:rPr>
-                <w:b/>
-                <w:color w:val="1A2B4A"/>
-                <w:sz w:val="18"/>
-                <w:rFonts w:ascii="Calibri" w:hAnsi="Calibri" w:cs="Calibri"/>
-              </w:rPr>
-              <w:t xml:space="preserve">Catégorie</w:t>
+              <w:t>Type</w:t>
             </w:r>
           </w:p>
         </w:tc>
@@ -308,11 +299,8 @@
             <w:tcW w:w="4593" w:type="dxa"/>
           </w:tcPr>
           <w:p>
-            <w:pPr>
-              <w:spacing w:after="0"/>
-            </w:pPr>
             <w:r>
-              <w:t>{{sk.kind|capitalize}}</w:t>
+              <w:t>{{sk.kind_label}}</w:t>
             </w:r>
           </w:p>
         </w:tc>
@@ -439,7 +427,7 @@
         <w:spacing w:after="80"/>
       </w:pPr>
       <w:r>
-        <w:t>Stack : {{skills_tool|map(attribute='name')|join(', ')}}</w:t>
+        <w:t>Stack : {{exp.skills_tool|map(attribute='name')|join(', ')}}</w:t>
       </w:r>
     </w:p>
     <w:p>
@@ -462,14 +450,7 @@
         </w:pBdr>
       </w:pPr>
       <w:r>
-        <w:rPr>
-          <w:b/>
-          <w:color w:val="1A2B4A"/>
-          <w:sz w:val="20"/>
-          <w:rFonts w:ascii="Calibri" w:hAnsi="Calibri" w:cs="Calibri"/>
-          <w:spacing w:val="40"/>
-        </w:rPr>
-        <w:t xml:space="preserve">FORMATION &amp; LANGUES</w:t>
+        <w:t>FORMATION, CERTIFICATIONS &amp; LANGUES</w:t>
       </w:r>
     </w:p>
     <w:p>
@@ -477,13 +458,102 @@
         <w:spacing w:after="0"/>
       </w:pPr>
       <w:r>
-        <w:rPr>
-          <w:i/>
-          <w:color w:val="595959"/>
-          <w:sz w:val="18"/>
-          <w:rFonts w:ascii="Calibri" w:hAnsi="Calibri" w:cs="Calibri"/>
-        </w:rPr>
-        <w:t xml:space="preserve">— À renseigner —</w:t>
+        <w:t>{%p if educations or certifications or languages %}</w:t>
+      </w:r>
+    </w:p>
+    <w:p>
+      <w:r>
+        <w:t>{%p if educations %}</w:t>
+      </w:r>
+    </w:p>
+    <w:p>
+      <w:r>
+        <w:t>Formation</w:t>
+      </w:r>
+    </w:p>
+    <w:p>
+      <w:r>
+        <w:t>{%p for edu in educations %}</w:t>
+      </w:r>
+    </w:p>
+    <w:p>
+      <w:r>
+        <w:t>{{edu.degree}} {{edu.field_of_study}} - {{edu.school}}{% if edu.period %} ({{edu.period}}){% endif %}</w:t>
+      </w:r>
+    </w:p>
+    <w:p>
+      <w:r>
+        <w:t>{%p endfor %}</w:t>
+      </w:r>
+    </w:p>
+    <w:p>
+      <w:r>
+        <w:t>{%p endif %}</w:t>
+      </w:r>
+    </w:p>
+    <w:p>
+      <w:r>
+        <w:t>{%p if certifications %}</w:t>
+      </w:r>
+    </w:p>
+    <w:p>
+      <w:r>
+        <w:t>Certifications</w:t>
+      </w:r>
+    </w:p>
+    <w:p>
+      <w:r>
+        <w:t>{%p for cert in certifications %}</w:t>
+      </w:r>
+    </w:p>
+    <w:p>
+      <w:r>
+        <w:t>{{cert.name}} - {{cert.issuer}}{% if cert.issue_date %} ({{cert.issue_date}}){% endif %}</w:t>
+      </w:r>
+    </w:p>
+    <w:p>
+      <w:r>
+        <w:t>{%p endfor %}</w:t>
+      </w:r>
+    </w:p>
+    <w:p>
+      <w:r>
+        <w:t>{%p endif %}</w:t>
+      </w:r>
+    </w:p>
+    <w:p>
+      <w:r>
+        <w:t>{%p if languages %}</w:t>
+      </w:r>
+    </w:p>
+    <w:p>
+      <w:r>
+        <w:t>Langues</w:t>
+      </w:r>
+    </w:p>
+    <w:p>
+      <w:r>
+        <w:t>{%p for lang in languages %}</w:t>
+      </w:r>
+    </w:p>
+    <w:p>
+      <w:r>
+        <w:t>{{lang.name}} - {{lang.level}} {{lang.level_label}}</w:t>
+      </w:r>
+    </w:p>
+    <w:p>
+      <w:r>
+        <w:t>{%p endfor %}</w:t>
+      </w:r>
+    </w:p>
+    <w:p>
+      <w:r>
+        <w:t>{%p endif %}</w:t>
+      </w:r>
+    </w:p>
+    <w:p>
+      <w:r>
+        <w:t>{%p endif %}</w:t>
       </w:r>
     </w:p>
     <w:sectPr>

</xml_diff>

<commit_message>
Fix builtin dossier template rendering (#35)
</commit_message>
<xml_diff>
--- a/backend/static/builtin_templates/compact_esn.docx
+++ b/backend/static/builtin_templates/compact_esn.docx
@@ -234,17 +234,8 @@
             <w:shd w:val="clear" w:color="auto" w:fill="F2F2F2"/>
           </w:tcPr>
           <w:p>
-            <w:pPr>
-              <w:spacing w:after="0"/>
-            </w:pPr>
             <w:r>
-              <w:rPr>
-                <w:b/>
-                <w:color w:val="1A2B4A"/>
-                <w:sz w:val="18"/>
-                <w:rFonts w:ascii="Calibri" w:hAnsi="Calibri" w:cs="Calibri"/>
-              </w:rPr>
-              <w:t xml:space="preserve">Catégorie</w:t>
+              <w:t>Type</w:t>
             </w:r>
           </w:p>
         </w:tc>
@@ -308,11 +299,8 @@
             <w:tcW w:w="4593" w:type="dxa"/>
           </w:tcPr>
           <w:p>
-            <w:pPr>
-              <w:spacing w:after="0"/>
-            </w:pPr>
             <w:r>
-              <w:t>{{sk.kind|capitalize}}</w:t>
+              <w:t>{{sk.kind_label}}</w:t>
             </w:r>
           </w:p>
         </w:tc>
@@ -439,7 +427,7 @@
         <w:spacing w:after="80"/>
       </w:pPr>
       <w:r>
-        <w:t>Stack : {{skills_tool|map(attribute='name')|join(', ')}}</w:t>
+        <w:t>Stack : {{exp.skills_tool|map(attribute='name')|join(', ')}}</w:t>
       </w:r>
     </w:p>
     <w:p>
@@ -462,14 +450,7 @@
         </w:pBdr>
       </w:pPr>
       <w:r>
-        <w:rPr>
-          <w:b/>
-          <w:color w:val="1A2B4A"/>
-          <w:sz w:val="20"/>
-          <w:rFonts w:ascii="Calibri" w:hAnsi="Calibri" w:cs="Calibri"/>
-          <w:spacing w:val="40"/>
-        </w:rPr>
-        <w:t xml:space="preserve">FORMATION &amp; LANGUES</w:t>
+        <w:t>FORMATION, CERTIFICATIONS &amp; LANGUES</w:t>
       </w:r>
     </w:p>
     <w:p>
@@ -477,13 +458,102 @@
         <w:spacing w:after="0"/>
       </w:pPr>
       <w:r>
-        <w:rPr>
-          <w:i/>
-          <w:color w:val="595959"/>
-          <w:sz w:val="18"/>
-          <w:rFonts w:ascii="Calibri" w:hAnsi="Calibri" w:cs="Calibri"/>
-        </w:rPr>
-        <w:t xml:space="preserve">— À renseigner —</w:t>
+        <w:t>{%p if educations or certifications or languages %}</w:t>
+      </w:r>
+    </w:p>
+    <w:p>
+      <w:r>
+        <w:t>{%p if educations %}</w:t>
+      </w:r>
+    </w:p>
+    <w:p>
+      <w:r>
+        <w:t>Formation</w:t>
+      </w:r>
+    </w:p>
+    <w:p>
+      <w:r>
+        <w:t>{%p for edu in educations %}</w:t>
+      </w:r>
+    </w:p>
+    <w:p>
+      <w:r>
+        <w:t>{{edu.degree}} {{edu.field_of_study}} - {{edu.school}}{% if edu.period %} ({{edu.period}}){% endif %}</w:t>
+      </w:r>
+    </w:p>
+    <w:p>
+      <w:r>
+        <w:t>{%p endfor %}</w:t>
+      </w:r>
+    </w:p>
+    <w:p>
+      <w:r>
+        <w:t>{%p endif %}</w:t>
+      </w:r>
+    </w:p>
+    <w:p>
+      <w:r>
+        <w:t>{%p if certifications %}</w:t>
+      </w:r>
+    </w:p>
+    <w:p>
+      <w:r>
+        <w:t>Certifications</w:t>
+      </w:r>
+    </w:p>
+    <w:p>
+      <w:r>
+        <w:t>{%p for cert in certifications %}</w:t>
+      </w:r>
+    </w:p>
+    <w:p>
+      <w:r>
+        <w:t>{{cert.name}} - {{cert.issuer}}{% if cert.issue_date %} ({{cert.issue_date}}){% endif %}</w:t>
+      </w:r>
+    </w:p>
+    <w:p>
+      <w:r>
+        <w:t>{%p endfor %}</w:t>
+      </w:r>
+    </w:p>
+    <w:p>
+      <w:r>
+        <w:t>{%p endif %}</w:t>
+      </w:r>
+    </w:p>
+    <w:p>
+      <w:r>
+        <w:t>{%p if languages %}</w:t>
+      </w:r>
+    </w:p>
+    <w:p>
+      <w:r>
+        <w:t>Langues</w:t>
+      </w:r>
+    </w:p>
+    <w:p>
+      <w:r>
+        <w:t>{%p for lang in languages %}</w:t>
+      </w:r>
+    </w:p>
+    <w:p>
+      <w:r>
+        <w:t>{{lang.name}} - {{lang.level}} {{lang.level_label}}</w:t>
+      </w:r>
+    </w:p>
+    <w:p>
+      <w:r>
+        <w:t>{%p endfor %}</w:t>
+      </w:r>
+    </w:p>
+    <w:p>
+      <w:r>
+        <w:t>{%p endif %}</w:t>
+      </w:r>
+    </w:p>
+    <w:p>
+      <w:r>
+        <w:t>{%p endif %}</w:t>
       </w:r>
     </w:p>
     <w:sectPr>

</xml_diff>

<commit_message>
fix: builtin dossier templates rendering and years of experience
- Split the merged 'Formation, certifications & langues' block into three
  styled sections in the 3 builtin .docx templates
- Make the years-of-experience header fragment conditional (no orphan text)
  and add it to dossier_technique
- Derive years of experience from experiences in docx_engine when the
  profile field is empty
- profil_premium: drop nested {%tr%} loop that duplicated all experiences
  in each per-experience header table
- dossier_technique: fix literal '?' mojibake (Priorité, Disponibilité)

Co-Authored-By: Claude Fable 5 <noreply@anthropic.com>
</commit_message>
<xml_diff>
--- a/backend/static/builtin_templates/compact_esn.docx
+++ b/backend/static/builtin_templates/compact_esn.docx
@@ -34,7 +34,7 @@
           <w:sz w:val="20"/>
           <w:rFonts w:ascii="Calibri" w:hAnsi="Calibri" w:cs="Calibri"/>
         </w:rPr>
-        <w:t xml:space="preserve">   ·   {{location}}   ·   {{years_of_experience}} ans d’expérience</w:t>
+        <w:t xml:space="preserve">   ·   {{location}}{% if years_of_experience %}   ·   {{years_of_experience}} ans d’expérience{% endif %}</w:t>
       </w:r>
     </w:p>
     <w:p>
@@ -443,6 +443,11 @@
       </w:r>
     </w:p>
     <w:p>
+      <w:r>
+        <w:t>{%p if educations %}</w:t>
+      </w:r>
+    </w:p>
+    <w:p>
       <w:pPr>
         <w:spacing w:before="160" w:after="80"/>
         <w:pBdr>
@@ -450,25 +455,14 @@
         </w:pBdr>
       </w:pPr>
       <w:r>
-        <w:t>FORMATION, CERTIFICATIONS &amp; LANGUES</w:t>
-      </w:r>
-    </w:p>
-    <w:p>
-      <w:pPr>
-        <w:spacing w:after="0"/>
-      </w:pPr>
-      <w:r>
-        <w:t>{%p if educations or certifications or languages %}</w:t>
-      </w:r>
-    </w:p>
-    <w:p>
-      <w:r>
-        <w:t>{%p if educations %}</w:t>
-      </w:r>
-    </w:p>
-    <w:p>
-      <w:r>
-        <w:t>Formation</w:t>
+        <w:rPr>
+          <w:b/>
+          <w:color w:val="1A2B4A"/>
+          <w:sz w:val="20"/>
+          <w:rFonts w:ascii="Calibri" w:hAnsi="Calibri" w:cs="Calibri"/>
+          <w:spacing w:val="40"/>
+        </w:rPr>
+        <w:t>FORMATION</w:t>
       </w:r>
     </w:p>
     <w:p>
@@ -497,8 +491,21 @@
       </w:r>
     </w:p>
     <w:p>
-      <w:r>
-        <w:t>Certifications</w:t>
+      <w:pPr>
+        <w:spacing w:before="160" w:after="80"/>
+        <w:pBdr>
+          <w:bottom w:val="single" w:sz="4" w:space="1" w:color="BFBFBF"/>
+        </w:pBdr>
+      </w:pPr>
+      <w:r>
+        <w:rPr>
+          <w:b/>
+          <w:color w:val="1A2B4A"/>
+          <w:sz w:val="20"/>
+          <w:rFonts w:ascii="Calibri" w:hAnsi="Calibri" w:cs="Calibri"/>
+          <w:spacing w:val="40"/>
+        </w:rPr>
+        <w:t>CERTIFICATIONS</w:t>
       </w:r>
     </w:p>
     <w:p>
@@ -527,8 +534,21 @@
       </w:r>
     </w:p>
     <w:p>
-      <w:r>
-        <w:t>Langues</w:t>
+      <w:pPr>
+        <w:spacing w:before="160" w:after="80"/>
+        <w:pBdr>
+          <w:bottom w:val="single" w:sz="4" w:space="1" w:color="BFBFBF"/>
+        </w:pBdr>
+      </w:pPr>
+      <w:r>
+        <w:rPr>
+          <w:b/>
+          <w:color w:val="1A2B4A"/>
+          <w:sz w:val="20"/>
+          <w:rFonts w:ascii="Calibri" w:hAnsi="Calibri" w:cs="Calibri"/>
+          <w:spacing w:val="40"/>
+        </w:rPr>
+        <w:t>LANGUES</w:t>
       </w:r>
     </w:p>
     <w:p>
@@ -544,11 +564,6 @@
     <w:p>
       <w:r>
         <w:t>{%p endfor %}</w:t>
-      </w:r>
-    </w:p>
-    <w:p>
-      <w:r>
-        <w:t>{%p endif %}</w:t>
       </w:r>
     </w:p>
     <w:p>

</xml_diff>